<commit_message>
feat(ex-01-owasp): updated definitions & solution
</commit_message>
<xml_diff>
--- a/exercices/owasp/01-E-183-ALL-OWASP-Definition.docx
+++ b/exercices/owasp/01-E-183-ALL-OWASP-Definition.docx
@@ -18,6 +18,14 @@
           <w:lang w:eastAsia="fr-CH"/>
         </w:rPr>
         <w:t>Top 10 OWASP</w:t>
+      </w:r>
+      <w:r>
+        <w:rPr>
+          <w:rFonts w:eastAsia="Times New Roman"/>
+          <w:color w:val="FF0000"/>
+          <w:lang w:eastAsia="fr-CH"/>
+        </w:rPr>
+        <w:t xml:space="preserve"> 2025</w:t>
       </w:r>
     </w:p>
     <w:p>
@@ -644,6 +652,7 @@
         <w:tc>
           <w:tcPr>
             <w:tcW w:w="2405" w:type="dxa"/>
+            <w:vAlign w:val="center"/>
           </w:tcPr>
           <w:p>
             <w:pPr>
@@ -668,12 +677,14 @@
               <w:top w:val="nil"/>
               <w:bottom w:val="nil"/>
             </w:tcBorders>
+            <w:vAlign w:val="center"/>
           </w:tcPr>
           <w:p/>
         </w:tc>
         <w:tc>
           <w:tcPr>
             <w:tcW w:w="5619" w:type="dxa"/>
+            <w:vAlign w:val="center"/>
           </w:tcPr>
           <w:p>
             <w:pPr>
@@ -687,7 +698,7 @@
                 <w:sz w:val="16"/>
                 <w:szCs w:val="16"/>
               </w:rPr>
-              <w:t>Erreurs dans la mise en œuvre de mécanismes de journalisation et de surveillance appropriés, ce qui peut rendre difficile la détection rapide des incidents de sécurité ou l'analyse des activités suspectes</w:t>
+              <w:t>Erreurs dans la mise en œuvre de mécanismes de journalisation, de surveillance et de réponse aux incidents, pouvant empêcher la détection rapide des attaques, retarder l’analyse des comportements suspects et limiter la capacité de réaction face aux incidents de sécurité.</w:t>
             </w:r>
           </w:p>
         </w:tc>
@@ -696,6 +707,7 @@
         <w:tc>
           <w:tcPr>
             <w:tcW w:w="2405" w:type="dxa"/>
+            <w:vAlign w:val="center"/>
           </w:tcPr>
           <w:p>
             <w:pPr>
@@ -704,29 +716,20 @@
                 <w:szCs w:val="20"/>
               </w:rPr>
             </w:pPr>
-            <w:proofErr w:type="spellStart"/>
             <w:r>
               <w:rPr>
                 <w:sz w:val="20"/>
                 <w:szCs w:val="20"/>
               </w:rPr>
-              <w:t>Cryptographic</w:t>
-            </w:r>
-            <w:proofErr w:type="spellEnd"/>
+              <w:t xml:space="preserve">Security </w:t>
+            </w:r>
+            <w:proofErr w:type="spellStart"/>
             <w:r>
               <w:rPr>
                 <w:sz w:val="20"/>
                 <w:szCs w:val="20"/>
               </w:rPr>
-              <w:t xml:space="preserve"> </w:t>
-            </w:r>
-            <w:proofErr w:type="spellStart"/>
-            <w:r>
-              <w:rPr>
-                <w:sz w:val="20"/>
-                <w:szCs w:val="20"/>
-              </w:rPr>
-              <w:t>Failures</w:t>
+              <w:t>Misconfiguration</w:t>
             </w:r>
             <w:proofErr w:type="spellEnd"/>
           </w:p>
@@ -738,12 +741,14 @@
               <w:top w:val="nil"/>
               <w:bottom w:val="nil"/>
             </w:tcBorders>
+            <w:vAlign w:val="center"/>
           </w:tcPr>
           <w:p/>
         </w:tc>
         <w:tc>
           <w:tcPr>
             <w:tcW w:w="5619" w:type="dxa"/>
+            <w:vAlign w:val="center"/>
           </w:tcPr>
           <w:p>
             <w:pPr>
@@ -757,7 +762,7 @@
                 <w:sz w:val="16"/>
                 <w:szCs w:val="16"/>
               </w:rPr>
-              <w:t>Vulnérabilités résultant de conceptions de sécurité faibles ou inexistantes au sein de l'architecture d'une application ou d'un système, ce qui rend difficile la mise en œuvre de contrôles de sécurité appropriés</w:t>
+              <w:t>Vulnérabilités issues de conceptions de sécurité insuffisantes ou inexistantes, notamment une mauvaise modélisation des menaces, une architecture non sécurisée ou l’absence de contrôles de sécurité dès la conception de l’application.</w:t>
             </w:r>
           </w:p>
         </w:tc>
@@ -766,6 +771,7 @@
         <w:tc>
           <w:tcPr>
             <w:tcW w:w="2405" w:type="dxa"/>
+            <w:vAlign w:val="center"/>
           </w:tcPr>
           <w:p>
             <w:pPr>
@@ -779,8 +785,33 @@
                 <w:sz w:val="20"/>
                 <w:szCs w:val="20"/>
               </w:rPr>
-              <w:t>Injection</w:t>
-            </w:r>
+              <w:t xml:space="preserve">Software </w:t>
+            </w:r>
+            <w:proofErr w:type="spellStart"/>
+            <w:r>
+              <w:rPr>
+                <w:sz w:val="20"/>
+                <w:szCs w:val="20"/>
+              </w:rPr>
+              <w:t>Supply</w:t>
+            </w:r>
+            <w:proofErr w:type="spellEnd"/>
+            <w:r>
+              <w:rPr>
+                <w:sz w:val="20"/>
+                <w:szCs w:val="20"/>
+              </w:rPr>
+              <w:t xml:space="preserve"> Chain </w:t>
+            </w:r>
+            <w:proofErr w:type="spellStart"/>
+            <w:r>
+              <w:rPr>
+                <w:sz w:val="20"/>
+                <w:szCs w:val="20"/>
+              </w:rPr>
+              <w:t>Failures</w:t>
+            </w:r>
+            <w:proofErr w:type="spellEnd"/>
           </w:p>
         </w:tc>
         <w:tc>
@@ -790,12 +821,14 @@
               <w:top w:val="nil"/>
               <w:bottom w:val="nil"/>
             </w:tcBorders>
+            <w:vAlign w:val="center"/>
           </w:tcPr>
           <w:p/>
         </w:tc>
         <w:tc>
           <w:tcPr>
             <w:tcW w:w="5619" w:type="dxa"/>
+            <w:vAlign w:val="center"/>
           </w:tcPr>
           <w:p>
             <w:pPr>
@@ -809,7 +842,7 @@
                 <w:sz w:val="16"/>
                 <w:szCs w:val="16"/>
               </w:rPr>
-              <w:t>Erreurs de configuration qui peuvent exposer involontairement des éléments de l'infrastructure, tels que des paramètres par défaut non sécurisés, des droits d'accès inappropriés ou des ports ouverts non nécessaires, pouvant être exploités par des attaquants.</w:t>
+              <w:t>Erreurs de configuration de sécurité exposant inutilement des composants de l’infrastructure ou de l’application, comme des paramètres par défaut non sécurisés, des services inutiles actifs, des ports ouverts ou des permissions excessives exploitables par des attaquants.</w:t>
             </w:r>
           </w:p>
         </w:tc>
@@ -818,6 +851,7 @@
         <w:tc>
           <w:tcPr>
             <w:tcW w:w="2405" w:type="dxa"/>
+            <w:vAlign w:val="center"/>
           </w:tcPr>
           <w:p>
             <w:pPr>
@@ -832,23 +866,25 @@
                 <w:sz w:val="20"/>
                 <w:szCs w:val="20"/>
               </w:rPr>
-              <w:t>Ins</w:t>
-            </w:r>
+              <w:t>Cryptographic</w:t>
+            </w:r>
+            <w:proofErr w:type="spellEnd"/>
             <w:r>
               <w:rPr>
                 <w:sz w:val="20"/>
                 <w:szCs w:val="20"/>
               </w:rPr>
-              <w:t>ecure</w:t>
-            </w:r>
-            <w:proofErr w:type="spellEnd"/>
+              <w:t xml:space="preserve"> </w:t>
+            </w:r>
+            <w:proofErr w:type="spellStart"/>
             <w:r>
               <w:rPr>
                 <w:sz w:val="20"/>
                 <w:szCs w:val="20"/>
               </w:rPr>
-              <w:t xml:space="preserve"> Design</w:t>
-            </w:r>
+              <w:t>Failures</w:t>
+            </w:r>
+            <w:proofErr w:type="spellEnd"/>
           </w:p>
         </w:tc>
         <w:tc>
@@ -858,12 +894,14 @@
               <w:top w:val="nil"/>
               <w:bottom w:val="nil"/>
             </w:tcBorders>
+            <w:vAlign w:val="center"/>
           </w:tcPr>
           <w:p/>
         </w:tc>
         <w:tc>
           <w:tcPr>
             <w:tcW w:w="5619" w:type="dxa"/>
+            <w:vAlign w:val="center"/>
           </w:tcPr>
           <w:p>
             <w:pPr>
@@ -877,7 +915,23 @@
                 <w:sz w:val="16"/>
                 <w:szCs w:val="16"/>
               </w:rPr>
-              <w:t>Utilisation de composants logiciels obsolètes ou vulnérables au sein d'une application, ce qui peut entraîner l'exploitation de failles de sécurité connues dans ces composants</w:t>
+              <w:t xml:space="preserve">Utilisation de composants logiciels obsolètes, non maintenus ou présentant des vulnérabilités connues, y compris des bibliothèques, </w:t>
+            </w:r>
+            <w:proofErr w:type="spellStart"/>
+            <w:r>
+              <w:rPr>
+                <w:sz w:val="16"/>
+                <w:szCs w:val="16"/>
+              </w:rPr>
+              <w:t>frameworks</w:t>
+            </w:r>
+            <w:proofErr w:type="spellEnd"/>
+            <w:r>
+              <w:rPr>
+                <w:sz w:val="16"/>
+                <w:szCs w:val="16"/>
+              </w:rPr>
+              <w:t xml:space="preserve"> ou dépendances tierces, pouvant faciliter l’exploitation de failles déjà documentées.</w:t>
             </w:r>
           </w:p>
         </w:tc>
@@ -886,6 +940,7 @@
         <w:tc>
           <w:tcPr>
             <w:tcW w:w="2405" w:type="dxa"/>
+            <w:vAlign w:val="center"/>
           </w:tcPr>
           <w:p>
             <w:pPr>
@@ -899,17 +954,8 @@
                 <w:sz w:val="20"/>
                 <w:szCs w:val="20"/>
               </w:rPr>
-              <w:t xml:space="preserve">Security </w:t>
-            </w:r>
-            <w:proofErr w:type="spellStart"/>
-            <w:r>
-              <w:rPr>
-                <w:sz w:val="20"/>
-                <w:szCs w:val="20"/>
-              </w:rPr>
-              <w:t>Misconfiguration</w:t>
-            </w:r>
-            <w:proofErr w:type="spellEnd"/>
+              <w:t>Injection</w:t>
+            </w:r>
           </w:p>
         </w:tc>
         <w:tc>
@@ -919,12 +965,14 @@
               <w:top w:val="nil"/>
               <w:bottom w:val="nil"/>
             </w:tcBorders>
+            <w:vAlign w:val="center"/>
           </w:tcPr>
           <w:p/>
         </w:tc>
         <w:tc>
           <w:tcPr>
             <w:tcW w:w="5619" w:type="dxa"/>
+            <w:vAlign w:val="center"/>
           </w:tcPr>
           <w:p>
             <w:pPr>
@@ -938,7 +986,7 @@
                 <w:sz w:val="16"/>
                 <w:szCs w:val="16"/>
               </w:rPr>
-              <w:t>Mauvaise gestion des contrôles d'accès dans une application ou un système, permettant à des utilisateurs non autorisés d'accéder à des ressources sensibles ou de modifier des données qu'ils ne sont pas autorisés à modifier.</w:t>
+              <w:t>Mauvaise gestion des contrôles d’accès, permettant à des utilisateurs ou systèmes d’accéder à des fonctionnalités ou des données auxquelles ils ne devraient pas avoir accès, ou d’effectuer des actions non autorisées.</w:t>
             </w:r>
           </w:p>
         </w:tc>
@@ -947,6 +995,7 @@
         <w:tc>
           <w:tcPr>
             <w:tcW w:w="2405" w:type="dxa"/>
+            <w:vAlign w:val="center"/>
           </w:tcPr>
           <w:p>
             <w:pPr>
@@ -961,7 +1010,7 @@
                 <w:sz w:val="20"/>
                 <w:szCs w:val="20"/>
               </w:rPr>
-              <w:t>Vulnerable</w:t>
+              <w:t>Insecure</w:t>
             </w:r>
             <w:proofErr w:type="spellEnd"/>
             <w:r>
@@ -969,23 +1018,7 @@
                 <w:sz w:val="20"/>
                 <w:szCs w:val="20"/>
               </w:rPr>
-              <w:t xml:space="preserve"> and </w:t>
-            </w:r>
-            <w:proofErr w:type="spellStart"/>
-            <w:r>
-              <w:rPr>
-                <w:sz w:val="20"/>
-                <w:szCs w:val="20"/>
-              </w:rPr>
-              <w:t>outdated</w:t>
-            </w:r>
-            <w:proofErr w:type="spellEnd"/>
-            <w:r>
-              <w:rPr>
-                <w:sz w:val="20"/>
-                <w:szCs w:val="20"/>
-              </w:rPr>
-              <w:t xml:space="preserve"> Components</w:t>
+              <w:t xml:space="preserve"> Design</w:t>
             </w:r>
           </w:p>
         </w:tc>
@@ -996,12 +1029,14 @@
               <w:top w:val="nil"/>
               <w:bottom w:val="nil"/>
             </w:tcBorders>
+            <w:vAlign w:val="center"/>
           </w:tcPr>
           <w:p/>
         </w:tc>
         <w:tc>
           <w:tcPr>
             <w:tcW w:w="5619" w:type="dxa"/>
+            <w:vAlign w:val="center"/>
           </w:tcPr>
           <w:p>
             <w:pPr>
@@ -1015,7 +1050,7 @@
                 <w:sz w:val="16"/>
                 <w:szCs w:val="16"/>
               </w:rPr>
-              <w:t>Vulnérabilités qui permettent à un attaquant d'injecter du code malveillant (comme du code SQL, NoSQL, OS ou LDAP) dans une application ou une base de données, pouvant entraîner l'exécution de commandes non autorisées ou la récupération de données sensible</w:t>
+              <w:t>Vulnérabilités permettant l’injection de données ou de commandes non fiables (comme SQL, NoSQL, OS, LDAP ou expressions), pouvant entraîner l’exécution de code malveillant, la fuite de données ou la compromission du système.</w:t>
             </w:r>
           </w:p>
         </w:tc>
@@ -1024,6 +1059,7 @@
         <w:tc>
           <w:tcPr>
             <w:tcW w:w="2405" w:type="dxa"/>
+            <w:vAlign w:val="center"/>
           </w:tcPr>
           <w:p>
             <w:pPr>
@@ -1032,12 +1068,21 @@
                 <w:szCs w:val="20"/>
               </w:rPr>
             </w:pPr>
+            <w:proofErr w:type="spellStart"/>
             <w:r>
               <w:rPr>
                 <w:sz w:val="20"/>
                 <w:szCs w:val="20"/>
               </w:rPr>
-              <w:t xml:space="preserve">Identification and Authentification </w:t>
+              <w:t>Authentication</w:t>
+            </w:r>
+            <w:proofErr w:type="spellEnd"/>
+            <w:r>
+              <w:rPr>
+                <w:sz w:val="20"/>
+                <w:szCs w:val="20"/>
+              </w:rPr>
+              <w:t xml:space="preserve"> </w:t>
             </w:r>
             <w:proofErr w:type="spellStart"/>
             <w:r>
@@ -1057,12 +1102,14 @@
               <w:top w:val="nil"/>
               <w:bottom w:val="nil"/>
             </w:tcBorders>
+            <w:vAlign w:val="center"/>
           </w:tcPr>
           <w:p/>
         </w:tc>
         <w:tc>
           <w:tcPr>
             <w:tcW w:w="5619" w:type="dxa"/>
+            <w:vAlign w:val="center"/>
           </w:tcPr>
           <w:p>
             <w:pPr>
@@ -1076,7 +1123,7 @@
                 <w:sz w:val="16"/>
                 <w:szCs w:val="16"/>
               </w:rPr>
-              <w:t>Erreurs dans la mise en œuvre de techniques de chiffrement et de hachage, ce qui peut conduire à des fuites de données sensibles ou à des attaques de contournement du chiffrement.</w:t>
+              <w:t>Erreurs dans l’implémentation des mécanismes cryptographiques, telles que l’utilisation d’algorithmes faibles, de clés mal gérées ou de données sensibles stockées ou transmises sans protection adéquate.</w:t>
             </w:r>
           </w:p>
         </w:tc>
@@ -1085,6 +1132,7 @@
         <w:tc>
           <w:tcPr>
             <w:tcW w:w="2405" w:type="dxa"/>
+            <w:vAlign w:val="center"/>
           </w:tcPr>
           <w:p>
             <w:pPr>
@@ -1100,7 +1148,7 @@
                 <w:szCs w:val="20"/>
                 <w:lang w:val="en-US"/>
               </w:rPr>
-              <w:t>Software and Data Integrity Failures</w:t>
+              <w:t>Software or Data Integrity Failures</w:t>
             </w:r>
           </w:p>
         </w:tc>
@@ -1111,6 +1159,7 @@
               <w:top w:val="nil"/>
               <w:bottom w:val="nil"/>
             </w:tcBorders>
+            <w:vAlign w:val="center"/>
           </w:tcPr>
           <w:p>
             <w:pPr>
@@ -1123,6 +1172,7 @@
         <w:tc>
           <w:tcPr>
             <w:tcW w:w="5619" w:type="dxa"/>
+            <w:vAlign w:val="center"/>
           </w:tcPr>
           <w:p>
             <w:pPr>
@@ -1136,7 +1186,23 @@
                 <w:sz w:val="16"/>
                 <w:szCs w:val="16"/>
               </w:rPr>
-              <w:t>Vulnérabilités liées à l'authentification des utilisateurs, telles que la mauvaise gestion des mots de passe, la transmission non sécurisée des informations d'identification, ou la faible fiabilité des mécanismes d'authentification</w:t>
+              <w:t xml:space="preserve">Failles liées à l’authentification et à la gestion des identités, comme des politiques de mots de passe faibles, une gestion incorrecte des sessions, l’absence de protections contre </w:t>
+            </w:r>
+            <w:proofErr w:type="gramStart"/>
+            <w:r>
+              <w:rPr>
+                <w:sz w:val="16"/>
+                <w:szCs w:val="16"/>
+              </w:rPr>
+              <w:t>le brute</w:t>
+            </w:r>
+            <w:proofErr w:type="gramEnd"/>
+            <w:r>
+              <w:rPr>
+                <w:sz w:val="16"/>
+                <w:szCs w:val="16"/>
+              </w:rPr>
+              <w:t xml:space="preserve"> force ou des mécanismes d’authentification mal implémentés.</w:t>
             </w:r>
           </w:p>
         </w:tc>
@@ -1145,6 +1211,7 @@
         <w:tc>
           <w:tcPr>
             <w:tcW w:w="2405" w:type="dxa"/>
+            <w:vAlign w:val="center"/>
           </w:tcPr>
           <w:p>
             <w:pPr>
@@ -1160,7 +1227,7 @@
                 <w:szCs w:val="20"/>
                 <w:lang w:val="en-US"/>
               </w:rPr>
-              <w:t>Security Logging and Monitoring Failures</w:t>
+              <w:t>Security Logging and Alerting Failures</w:t>
             </w:r>
           </w:p>
         </w:tc>
@@ -1171,6 +1238,7 @@
               <w:top w:val="nil"/>
               <w:bottom w:val="nil"/>
             </w:tcBorders>
+            <w:vAlign w:val="center"/>
           </w:tcPr>
           <w:p>
             <w:pPr>
@@ -1183,6 +1251,7 @@
         <w:tc>
           <w:tcPr>
             <w:tcW w:w="5619" w:type="dxa"/>
+            <w:vAlign w:val="center"/>
           </w:tcPr>
           <w:p>
             <w:pPr>
@@ -1196,7 +1265,7 @@
                 <w:sz w:val="16"/>
                 <w:szCs w:val="16"/>
               </w:rPr>
-              <w:t>Vulnérabilité qui permet à un attaquant de forcer le serveur à effectuer des requêtes vers des ressources internes ou externes, pouvant entraîner l'exposition de données sensibles ou l'exploitation de services internes.</w:t>
+              <w:t>Vulnérabilités permettant des requêtes non contrôlées vers des ressources internes ou externes, pouvant être exploitées pour accéder à des services internes, exfiltrer des données ou contourner les protections réseau.</w:t>
             </w:r>
           </w:p>
         </w:tc>
@@ -1205,6 +1274,7 @@
         <w:tc>
           <w:tcPr>
             <w:tcW w:w="2405" w:type="dxa"/>
+            <w:vAlign w:val="center"/>
           </w:tcPr>
           <w:p>
             <w:pPr>
@@ -1220,7 +1290,7 @@
                 <w:szCs w:val="20"/>
                 <w:lang w:val="en-US"/>
               </w:rPr>
-              <w:t>Server-Side Request Forgery (SSRF)</w:t>
+              <w:t>Mishandling of Exceptional Conditions</w:t>
             </w:r>
           </w:p>
         </w:tc>
@@ -1231,6 +1301,7 @@
               <w:top w:val="nil"/>
               <w:bottom w:val="nil"/>
             </w:tcBorders>
+            <w:vAlign w:val="center"/>
           </w:tcPr>
           <w:p>
             <w:pPr>
@@ -1243,6 +1314,7 @@
         <w:tc>
           <w:tcPr>
             <w:tcW w:w="5619" w:type="dxa"/>
+            <w:vAlign w:val="center"/>
           </w:tcPr>
           <w:p>
             <w:pPr>
@@ -1256,7 +1328,7 @@
                 <w:sz w:val="16"/>
                 <w:szCs w:val="16"/>
               </w:rPr>
-              <w:t>Vulnérabilités qui permettent à un attaquant de modifier ou de corrompre des données stockées dans une application ou un système, compromettant ainsi l'intégrité des données et pouvant entraîner des résultats indésirables ou malveillants.</w:t>
+              <w:t>Vulnérabilités compromettant l’intégrité des données ou de l’application, permettant la modification non autorisée de données, de configurations ou de flux applicatifs, entraînant des comportements imprévus ou malveillants.</w:t>
             </w:r>
           </w:p>
         </w:tc>
@@ -1267,6 +1339,7 @@
         <w:pStyle w:val="Titre1"/>
       </w:pPr>
       <w:r>
+        <w:lastRenderedPageBreak/>
         <w:t>Liens et références</w:t>
       </w:r>
     </w:p>
@@ -1276,7 +1349,7 @@
           <w:rPr>
             <w:rStyle w:val="Lienhypertexte"/>
           </w:rPr>
-          <w:t>https://owasp.org/www-project-top-ten/</w:t>
+          <w:t>https://owasp.org/Top10/2025/</w:t>
         </w:r>
       </w:hyperlink>
     </w:p>
@@ -2934,6 +3007,26 @@
 </file>
 
 <file path=customXml/item1.xml><?xml version="1.0" encoding="utf-8"?>
+<?mso-contentType ?>
+<FormTemplates xmlns="http://schemas.microsoft.com/sharepoint/v3/contenttype/forms">
+  <Display>DocumentLibraryForm</Display>
+  <Edit>DocumentLibraryForm</Edit>
+  <New>DocumentLibraryForm</New>
+</FormTemplates>
+</file>
+
+<file path=customXml/item2.xml><?xml version="1.0" encoding="utf-8"?>
+<p:properties xmlns:p="http://schemas.microsoft.com/office/2006/metadata/properties" xmlns:xsi="http://www.w3.org/2001/XMLSchema-instance" xmlns:pc="http://schemas.microsoft.com/office/infopath/2007/PartnerControls">
+  <documentManagement>
+    <lcf76f155ced4ddcb4097134ff3c332f xmlns="eb2b4dc0-5538-4988-a426-1e3bf3687743">
+      <Terms xmlns="http://schemas.microsoft.com/office/infopath/2007/PartnerControls"/>
+    </lcf76f155ced4ddcb4097134ff3c332f>
+    <TaxCatchAll xmlns="26488081-7094-48e3-a435-bbb366c5709a" xsi:nil="true"/>
+  </documentManagement>
+</p:properties>
+</file>
+
+<file path=customXml/item3.xml><?xml version="1.0" encoding="utf-8"?>
 <ct:contentTypeSchema xmlns:ct="http://schemas.microsoft.com/office/2006/metadata/contentType" xmlns:ma="http://schemas.microsoft.com/office/2006/metadata/properties/metaAttributes" ct:_="" ma:_="" ma:contentTypeName="Document" ma:contentTypeID="0x010100BD12CA962D3BC343BA4881942FCA9ABD" ma:contentTypeVersion="13" ma:contentTypeDescription="Crée un document." ma:contentTypeScope="" ma:versionID="69c7e1234aa399a5294368cedfc9727e">
   <xsd:schema xmlns:xsd="http://www.w3.org/2001/XMLSchema" xmlns:xs="http://www.w3.org/2001/XMLSchema" xmlns:p="http://schemas.microsoft.com/office/2006/metadata/properties" xmlns:ns2="eb2b4dc0-5538-4988-a426-1e3bf3687743" xmlns:ns3="26488081-7094-48e3-a435-bbb366c5709a" targetNamespace="http://schemas.microsoft.com/office/2006/metadata/properties" ma:root="true" ma:fieldsID="f55906f2b711226ab16b0d1a2f445893" ns2:_="" ns3:_="">
     <xsd:import namespace="eb2b4dc0-5538-4988-a426-1e3bf3687743"/>
@@ -3140,27 +3233,26 @@
 </ct:contentTypeSchema>
 </file>
 
-<file path=customXml/item2.xml><?xml version="1.0" encoding="utf-8"?>
-<p:properties xmlns:p="http://schemas.microsoft.com/office/2006/metadata/properties" xmlns:xsi="http://www.w3.org/2001/XMLSchema-instance" xmlns:pc="http://schemas.microsoft.com/office/infopath/2007/PartnerControls">
-  <documentManagement>
-    <lcf76f155ced4ddcb4097134ff3c332f xmlns="eb2b4dc0-5538-4988-a426-1e3bf3687743">
-      <Terms xmlns="http://schemas.microsoft.com/office/infopath/2007/PartnerControls"/>
-    </lcf76f155ced4ddcb4097134ff3c332f>
-    <TaxCatchAll xmlns="26488081-7094-48e3-a435-bbb366c5709a" xsi:nil="true"/>
-  </documentManagement>
-</p:properties>
+<file path=customXml/itemProps1.xml><?xml version="1.0" encoding="utf-8"?>
+<ds:datastoreItem xmlns:ds="http://schemas.openxmlformats.org/officeDocument/2006/customXml" ds:itemID="{D6A0AF13-3C59-4CBC-BC7A-60CF4496DE77}">
+  <ds:schemaRefs>
+    <ds:schemaRef ds:uri="http://schemas.microsoft.com/sharepoint/v3/contenttype/forms"/>
+  </ds:schemaRefs>
+</ds:datastoreItem>
 </file>
 
-<file path=customXml/item3.xml><?xml version="1.0" encoding="utf-8"?>
-<?mso-contentType ?>
-<FormTemplates xmlns="http://schemas.microsoft.com/sharepoint/v3/contenttype/forms">
-  <Display>DocumentLibraryForm</Display>
-  <Edit>DocumentLibraryForm</Edit>
-  <New>DocumentLibraryForm</New>
-</FormTemplates>
+<file path=customXml/itemProps2.xml><?xml version="1.0" encoding="utf-8"?>
+<ds:datastoreItem xmlns:ds="http://schemas.openxmlformats.org/officeDocument/2006/customXml" ds:itemID="{BD37BDC5-E78C-4C6C-A281-6FAAE003638E}">
+  <ds:schemaRefs>
+    <ds:schemaRef ds:uri="http://schemas.microsoft.com/office/2006/metadata/properties"/>
+    <ds:schemaRef ds:uri="http://schemas.microsoft.com/office/infopath/2007/PartnerControls"/>
+    <ds:schemaRef ds:uri="eb2b4dc0-5538-4988-a426-1e3bf3687743"/>
+    <ds:schemaRef ds:uri="26488081-7094-48e3-a435-bbb366c5709a"/>
+  </ds:schemaRefs>
+</ds:datastoreItem>
 </file>
 
-<file path=customXml/itemProps1.xml><?xml version="1.0" encoding="utf-8"?>
+<file path=customXml/itemProps3.xml><?xml version="1.0" encoding="utf-8"?>
 <ds:datastoreItem xmlns:ds="http://schemas.openxmlformats.org/officeDocument/2006/customXml" ds:itemID="{8576B3C6-6C9D-4006-A98D-172413B64D1F}">
   <ds:schemaRefs>
     <ds:schemaRef ds:uri="http://schemas.microsoft.com/office/2006/metadata/contentType"/>
@@ -3177,23 +3269,4 @@
     <ds:schemaRef ds:uri="http://schemas.microsoft.com/internal/obd"/>
   </ds:schemaRefs>
 </ds:datastoreItem>
-</file>
-
-<file path=customXml/itemProps2.xml><?xml version="1.0" encoding="utf-8"?>
-<ds:datastoreItem xmlns:ds="http://schemas.openxmlformats.org/officeDocument/2006/customXml" ds:itemID="{BD37BDC5-E78C-4C6C-A281-6FAAE003638E}">
-  <ds:schemaRefs>
-    <ds:schemaRef ds:uri="http://schemas.microsoft.com/office/2006/metadata/properties"/>
-    <ds:schemaRef ds:uri="http://schemas.microsoft.com/office/infopath/2007/PartnerControls"/>
-    <ds:schemaRef ds:uri="eb2b4dc0-5538-4988-a426-1e3bf3687743"/>
-    <ds:schemaRef ds:uri="26488081-7094-48e3-a435-bbb366c5709a"/>
-  </ds:schemaRefs>
-</ds:datastoreItem>
-</file>
-
-<file path=customXml/itemProps3.xml><?xml version="1.0" encoding="utf-8"?>
-<ds:datastoreItem xmlns:ds="http://schemas.openxmlformats.org/officeDocument/2006/customXml" ds:itemID="{D6A0AF13-3C59-4CBC-BC7A-60CF4496DE77}">
-  <ds:schemaRefs>
-    <ds:schemaRef ds:uri="http://schemas.microsoft.com/sharepoint/v3/contenttype/forms"/>
-  </ds:schemaRefs>
-</ds:datastoreItem>
 </file>
</xml_diff>

<commit_message>
feat(ex01-owasp+slides): added a slide for the 10th top10 entry + small corrections on the ex01
</commit_message>
<xml_diff>
--- a/exercices/owasp/01-E-183-ALL-OWASP-Definition.docx
+++ b/exercices/owasp/01-E-183-ALL-OWASP-Definition.docx
@@ -657,13 +657,11 @@
           <w:p>
             <w:pPr>
               <w:rPr>
-                <w:sz w:val="20"/>
                 <w:szCs w:val="20"/>
               </w:rPr>
             </w:pPr>
             <w:r>
               <w:rPr>
-                <w:sz w:val="20"/>
                 <w:szCs w:val="20"/>
               </w:rPr>
               <w:t>Broken Access Control</w:t>
@@ -712,13 +710,11 @@
           <w:p>
             <w:pPr>
               <w:rPr>
-                <w:sz w:val="20"/>
                 <w:szCs w:val="20"/>
               </w:rPr>
             </w:pPr>
             <w:r>
               <w:rPr>
-                <w:sz w:val="20"/>
                 <w:szCs w:val="20"/>
               </w:rPr>
               <w:t xml:space="preserve">Security </w:t>
@@ -726,7 +722,6 @@
             <w:proofErr w:type="spellStart"/>
             <w:r>
               <w:rPr>
-                <w:sz w:val="20"/>
                 <w:szCs w:val="20"/>
               </w:rPr>
               <w:t>Misconfiguration</w:t>
@@ -776,13 +771,11 @@
           <w:p>
             <w:pPr>
               <w:rPr>
-                <w:sz w:val="20"/>
                 <w:szCs w:val="20"/>
               </w:rPr>
             </w:pPr>
             <w:r>
               <w:rPr>
-                <w:sz w:val="20"/>
                 <w:szCs w:val="20"/>
               </w:rPr>
               <w:t xml:space="preserve">Software </w:t>
@@ -790,7 +783,6 @@
             <w:proofErr w:type="spellStart"/>
             <w:r>
               <w:rPr>
-                <w:sz w:val="20"/>
                 <w:szCs w:val="20"/>
               </w:rPr>
               <w:t>Supply</w:t>
@@ -798,7 +790,6 @@
             <w:proofErr w:type="spellEnd"/>
             <w:r>
               <w:rPr>
-                <w:sz w:val="20"/>
                 <w:szCs w:val="20"/>
               </w:rPr>
               <w:t xml:space="preserve"> Chain </w:t>
@@ -806,7 +797,6 @@
             <w:proofErr w:type="spellStart"/>
             <w:r>
               <w:rPr>
-                <w:sz w:val="20"/>
                 <w:szCs w:val="20"/>
               </w:rPr>
               <w:t>Failures</w:t>
@@ -856,14 +846,12 @@
           <w:p>
             <w:pPr>
               <w:rPr>
-                <w:sz w:val="20"/>
                 <w:szCs w:val="20"/>
               </w:rPr>
             </w:pPr>
             <w:proofErr w:type="spellStart"/>
             <w:r>
               <w:rPr>
-                <w:sz w:val="20"/>
                 <w:szCs w:val="20"/>
               </w:rPr>
               <w:t>Cryptographic</w:t>
@@ -871,7 +859,6 @@
             <w:proofErr w:type="spellEnd"/>
             <w:r>
               <w:rPr>
-                <w:sz w:val="20"/>
                 <w:szCs w:val="20"/>
               </w:rPr>
               <w:t xml:space="preserve"> </w:t>
@@ -879,7 +866,6 @@
             <w:proofErr w:type="spellStart"/>
             <w:r>
               <w:rPr>
-                <w:sz w:val="20"/>
                 <w:szCs w:val="20"/>
               </w:rPr>
               <w:t>Failures</w:t>
@@ -945,13 +931,11 @@
           <w:p>
             <w:pPr>
               <w:rPr>
-                <w:sz w:val="20"/>
                 <w:szCs w:val="20"/>
               </w:rPr>
             </w:pPr>
             <w:r>
               <w:rPr>
-                <w:sz w:val="20"/>
                 <w:szCs w:val="20"/>
               </w:rPr>
               <w:t>Injection</w:t>
@@ -1000,14 +984,12 @@
           <w:p>
             <w:pPr>
               <w:rPr>
-                <w:sz w:val="20"/>
                 <w:szCs w:val="20"/>
               </w:rPr>
             </w:pPr>
             <w:proofErr w:type="spellStart"/>
             <w:r>
               <w:rPr>
-                <w:sz w:val="20"/>
                 <w:szCs w:val="20"/>
               </w:rPr>
               <w:t>Insecure</w:t>
@@ -1015,7 +997,6 @@
             <w:proofErr w:type="spellEnd"/>
             <w:r>
               <w:rPr>
-                <w:sz w:val="20"/>
                 <w:szCs w:val="20"/>
               </w:rPr>
               <w:t xml:space="preserve"> Design</w:t>
@@ -1064,14 +1045,12 @@
           <w:p>
             <w:pPr>
               <w:rPr>
-                <w:sz w:val="20"/>
                 <w:szCs w:val="20"/>
               </w:rPr>
             </w:pPr>
             <w:proofErr w:type="spellStart"/>
             <w:r>
               <w:rPr>
-                <w:sz w:val="20"/>
                 <w:szCs w:val="20"/>
               </w:rPr>
               <w:t>Authentication</w:t>
@@ -1079,7 +1058,6 @@
             <w:proofErr w:type="spellEnd"/>
             <w:r>
               <w:rPr>
-                <w:sz w:val="20"/>
                 <w:szCs w:val="20"/>
               </w:rPr>
               <w:t xml:space="preserve"> </w:t>
@@ -1087,7 +1065,6 @@
             <w:proofErr w:type="spellStart"/>
             <w:r>
               <w:rPr>
-                <w:sz w:val="20"/>
                 <w:szCs w:val="20"/>
               </w:rPr>
               <w:t>Failures</w:t>
@@ -1137,14 +1114,12 @@
           <w:p>
             <w:pPr>
               <w:rPr>
-                <w:sz w:val="20"/>
                 <w:szCs w:val="20"/>
                 <w:lang w:val="en-US"/>
               </w:rPr>
             </w:pPr>
             <w:r>
               <w:rPr>
-                <w:sz w:val="20"/>
                 <w:szCs w:val="20"/>
                 <w:lang w:val="en-US"/>
               </w:rPr>
@@ -1216,14 +1191,12 @@
           <w:p>
             <w:pPr>
               <w:rPr>
-                <w:sz w:val="20"/>
                 <w:szCs w:val="20"/>
                 <w:lang w:val="en-US"/>
               </w:rPr>
             </w:pPr>
             <w:r>
               <w:rPr>
-                <w:sz w:val="20"/>
                 <w:szCs w:val="20"/>
                 <w:lang w:val="en-US"/>
               </w:rPr>
@@ -1265,7 +1238,7 @@
                 <w:sz w:val="16"/>
                 <w:szCs w:val="16"/>
               </w:rPr>
-              <w:t>Vulnérabilités permettant des requêtes non contrôlées vers des ressources internes ou externes, pouvant être exploitées pour accéder à des services internes, exfiltrer des données ou contourner les protections réseau.</w:t>
+              <w:t>Gestion incorrecte des erreurs ou des conditions exceptionnelles, pouvant exposer des informations ou causer des interruptions.</w:t>
             </w:r>
           </w:p>
         </w:tc>
@@ -1279,14 +1252,12 @@
           <w:p>
             <w:pPr>
               <w:rPr>
-                <w:sz w:val="20"/>
                 <w:szCs w:val="20"/>
                 <w:lang w:val="en-US"/>
               </w:rPr>
             </w:pPr>
             <w:r>
               <w:rPr>
-                <w:sz w:val="20"/>
                 <w:szCs w:val="20"/>
                 <w:lang w:val="en-US"/>
               </w:rPr>
@@ -1339,7 +1310,6 @@
         <w:pStyle w:val="Titre1"/>
       </w:pPr>
       <w:r>
-        <w:lastRenderedPageBreak/>
         <w:t>Liens et références</w:t>
       </w:r>
     </w:p>
@@ -2358,13 +2328,13 @@
   <w:style w:type="paragraph" w:default="1" w:styleId="Normal">
     <w:name w:val="Normal"/>
     <w:qFormat/>
-    <w:rsid w:val="0070276F"/>
+    <w:rsid w:val="00051F3E"/>
     <w:pPr>
       <w:spacing w:line="360" w:lineRule="auto"/>
     </w:pPr>
     <w:rPr>
       <w:rFonts w:ascii="Century Gothic" w:hAnsi="Century Gothic"/>
-      <w:sz w:val="24"/>
+      <w:sz w:val="20"/>
     </w:rPr>
   </w:style>
   <w:style w:type="paragraph" w:styleId="Titre1">
@@ -2414,7 +2384,6 @@
   <w:style w:type="character" w:default="1" w:styleId="Policepardfaut">
     <w:name w:val="Default Paragraph Font"/>
     <w:uiPriority w:val="1"/>
-    <w:semiHidden/>
     <w:unhideWhenUsed/>
   </w:style>
   <w:style w:type="table" w:default="1" w:styleId="TableauNormal">
@@ -3007,26 +2976,6 @@
 </file>
 
 <file path=customXml/item1.xml><?xml version="1.0" encoding="utf-8"?>
-<?mso-contentType ?>
-<FormTemplates xmlns="http://schemas.microsoft.com/sharepoint/v3/contenttype/forms">
-  <Display>DocumentLibraryForm</Display>
-  <Edit>DocumentLibraryForm</Edit>
-  <New>DocumentLibraryForm</New>
-</FormTemplates>
-</file>
-
-<file path=customXml/item2.xml><?xml version="1.0" encoding="utf-8"?>
-<p:properties xmlns:p="http://schemas.microsoft.com/office/2006/metadata/properties" xmlns:xsi="http://www.w3.org/2001/XMLSchema-instance" xmlns:pc="http://schemas.microsoft.com/office/infopath/2007/PartnerControls">
-  <documentManagement>
-    <lcf76f155ced4ddcb4097134ff3c332f xmlns="eb2b4dc0-5538-4988-a426-1e3bf3687743">
-      <Terms xmlns="http://schemas.microsoft.com/office/infopath/2007/PartnerControls"/>
-    </lcf76f155ced4ddcb4097134ff3c332f>
-    <TaxCatchAll xmlns="26488081-7094-48e3-a435-bbb366c5709a" xsi:nil="true"/>
-  </documentManagement>
-</p:properties>
-</file>
-
-<file path=customXml/item3.xml><?xml version="1.0" encoding="utf-8"?>
 <ct:contentTypeSchema xmlns:ct="http://schemas.microsoft.com/office/2006/metadata/contentType" xmlns:ma="http://schemas.microsoft.com/office/2006/metadata/properties/metaAttributes" ct:_="" ma:_="" ma:contentTypeName="Document" ma:contentTypeID="0x010100BD12CA962D3BC343BA4881942FCA9ABD" ma:contentTypeVersion="13" ma:contentTypeDescription="Crée un document." ma:contentTypeScope="" ma:versionID="69c7e1234aa399a5294368cedfc9727e">
   <xsd:schema xmlns:xsd="http://www.w3.org/2001/XMLSchema" xmlns:xs="http://www.w3.org/2001/XMLSchema" xmlns:p="http://schemas.microsoft.com/office/2006/metadata/properties" xmlns:ns2="eb2b4dc0-5538-4988-a426-1e3bf3687743" xmlns:ns3="26488081-7094-48e3-a435-bbb366c5709a" targetNamespace="http://schemas.microsoft.com/office/2006/metadata/properties" ma:root="true" ma:fieldsID="f55906f2b711226ab16b0d1a2f445893" ns2:_="" ns3:_="">
     <xsd:import namespace="eb2b4dc0-5538-4988-a426-1e3bf3687743"/>
@@ -3233,10 +3182,41 @@
 </ct:contentTypeSchema>
 </file>
 
+<file path=customXml/item2.xml><?xml version="1.0" encoding="utf-8"?>
+<p:properties xmlns:p="http://schemas.microsoft.com/office/2006/metadata/properties" xmlns:xsi="http://www.w3.org/2001/XMLSchema-instance" xmlns:pc="http://schemas.microsoft.com/office/infopath/2007/PartnerControls">
+  <documentManagement>
+    <lcf76f155ced4ddcb4097134ff3c332f xmlns="eb2b4dc0-5538-4988-a426-1e3bf3687743">
+      <Terms xmlns="http://schemas.microsoft.com/office/infopath/2007/PartnerControls"/>
+    </lcf76f155ced4ddcb4097134ff3c332f>
+    <TaxCatchAll xmlns="26488081-7094-48e3-a435-bbb366c5709a" xsi:nil="true"/>
+  </documentManagement>
+</p:properties>
+</file>
+
+<file path=customXml/item3.xml><?xml version="1.0" encoding="utf-8"?>
+<?mso-contentType ?>
+<FormTemplates xmlns="http://schemas.microsoft.com/sharepoint/v3/contenttype/forms">
+  <Display>DocumentLibraryForm</Display>
+  <Edit>DocumentLibraryForm</Edit>
+  <New>DocumentLibraryForm</New>
+</FormTemplates>
+</file>
+
 <file path=customXml/itemProps1.xml><?xml version="1.0" encoding="utf-8"?>
-<ds:datastoreItem xmlns:ds="http://schemas.openxmlformats.org/officeDocument/2006/customXml" ds:itemID="{D6A0AF13-3C59-4CBC-BC7A-60CF4496DE77}">
+<ds:datastoreItem xmlns:ds="http://schemas.openxmlformats.org/officeDocument/2006/customXml" ds:itemID="{8576B3C6-6C9D-4006-A98D-172413B64D1F}">
   <ds:schemaRefs>
-    <ds:schemaRef ds:uri="http://schemas.microsoft.com/sharepoint/v3/contenttype/forms"/>
+    <ds:schemaRef ds:uri="http://schemas.microsoft.com/office/2006/metadata/contentType"/>
+    <ds:schemaRef ds:uri="http://schemas.microsoft.com/office/2006/metadata/properties/metaAttributes"/>
+    <ds:schemaRef ds:uri="http://www.w3.org/2001/XMLSchema"/>
+    <ds:schemaRef ds:uri="http://schemas.microsoft.com/office/2006/metadata/properties"/>
+    <ds:schemaRef ds:uri="eb2b4dc0-5538-4988-a426-1e3bf3687743"/>
+    <ds:schemaRef ds:uri="26488081-7094-48e3-a435-bbb366c5709a"/>
+    <ds:schemaRef ds:uri="http://schemas.microsoft.com/office/2006/documentManagement/types"/>
+    <ds:schemaRef ds:uri="http://schemas.microsoft.com/office/infopath/2007/PartnerControls"/>
+    <ds:schemaRef ds:uri="http://schemas.openxmlformats.org/package/2006/metadata/core-properties"/>
+    <ds:schemaRef ds:uri="http://purl.org/dc/elements/1.1/"/>
+    <ds:schemaRef ds:uri="http://purl.org/dc/terms/"/>
+    <ds:schemaRef ds:uri="http://schemas.microsoft.com/internal/obd"/>
   </ds:schemaRefs>
 </ds:datastoreItem>
 </file>
@@ -3253,20 +3233,9 @@
 </file>
 
 <file path=customXml/itemProps3.xml><?xml version="1.0" encoding="utf-8"?>
-<ds:datastoreItem xmlns:ds="http://schemas.openxmlformats.org/officeDocument/2006/customXml" ds:itemID="{8576B3C6-6C9D-4006-A98D-172413B64D1F}">
+<ds:datastoreItem xmlns:ds="http://schemas.openxmlformats.org/officeDocument/2006/customXml" ds:itemID="{D6A0AF13-3C59-4CBC-BC7A-60CF4496DE77}">
   <ds:schemaRefs>
-    <ds:schemaRef ds:uri="http://schemas.microsoft.com/office/2006/metadata/contentType"/>
-    <ds:schemaRef ds:uri="http://schemas.microsoft.com/office/2006/metadata/properties/metaAttributes"/>
-    <ds:schemaRef ds:uri="http://www.w3.org/2001/XMLSchema"/>
-    <ds:schemaRef ds:uri="http://schemas.microsoft.com/office/2006/metadata/properties"/>
-    <ds:schemaRef ds:uri="eb2b4dc0-5538-4988-a426-1e3bf3687743"/>
-    <ds:schemaRef ds:uri="26488081-7094-48e3-a435-bbb366c5709a"/>
-    <ds:schemaRef ds:uri="http://schemas.microsoft.com/office/2006/documentManagement/types"/>
-    <ds:schemaRef ds:uri="http://schemas.microsoft.com/office/infopath/2007/PartnerControls"/>
-    <ds:schemaRef ds:uri="http://schemas.openxmlformats.org/package/2006/metadata/core-properties"/>
-    <ds:schemaRef ds:uri="http://purl.org/dc/elements/1.1/"/>
-    <ds:schemaRef ds:uri="http://purl.org/dc/terms/"/>
-    <ds:schemaRef ds:uri="http://schemas.microsoft.com/internal/obd"/>
+    <ds:schemaRef ds:uri="http://schemas.microsoft.com/sharepoint/v3/contenttype/forms"/>
   </ds:schemaRefs>
 </ds:datastoreItem>
 </file>
</xml_diff>